<commit_message>
Rename /protfolio to /case-studies and refresh the handover document
The Case Studies page was reachable at a misspelled address. It now sits
at /case-studies, with permanent redirects from /protfolio and
/protfolio/:slug so existing links, bookmarks and any indexed copies keep
working and pass their search value to the new address.

Navigation, breadcrumbs, page metadata and the sitemap all updated.

The handover document is regenerated: it no longer refers to the site
having started from a template, and the note about the misspelled
address is replaced with a short explanation of how web addresses work.

Co-Authored-By: Claude Opus 5 <noreply@anthropic.com>
</commit_message>
<xml_diff>
--- a/docs/Vulpian-Consultants-Project-Handover.docx
+++ b/docs/Vulpian-Consultants-Project-Handover.docx
@@ -1884,7 +1884,7 @@
                 <w:b/>
                 <w:sz w:val="18"/>
               </w:rPr>
-              <w:t>/protfolio</w:t>
+              <w:t>/case-studies</w:t>
             </w:r>
           </w:p>
         </w:tc>
@@ -2217,7 +2217,7 @@
         <w:tc>
           <w:tcPr>
             <w:tcW w:type="dxa" w:w="9360"/>
-            <w:shd w:val="clear" w:fill="FDF5E6"/>
+            <w:shd w:val="clear" w:fill="EAF0FA"/>
           </w:tcPr>
           <w:p>
             <w:pPr>
@@ -2227,10 +2227,10 @@
             <w:r>
               <w:rPr>
                 <w:b/>
-                <w:color w:val="8A5700"/>
+                <w:color w:val="3866B1"/>
                 <w:sz w:val="17"/>
               </w:rPr>
-              <w:t>WORTH KNOWING</w:t>
+              <w:t>WEB ADDRESSES</w:t>
             </w:r>
           </w:p>
           <w:p>
@@ -2242,7 +2242,7 @@
                 <w:color w:val="1B2636"/>
                 <w:sz w:val="20"/>
               </w:rPr>
-              <w:t>The Case Studies page sits at /protfolio — a spelling mistake inherited from the original template. It works, and search engines treat it as a normal address, but if you would rather it read /case-studies it is a small change now and a slightly larger one once the page has been indexed.</w:t>
+              <w:t>Addresses are lower case and readable, which both visitors and search engines prefer. Service and article addresses are generated from their titles, so they stay consistent without anyone having to think about them.</w:t>
             </w:r>
           </w:p>
         </w:tc>
@@ -3490,7 +3490,7 @@
           <w:color w:val="1B2636"/>
           <w:sz w:val="22"/>
         </w:rPr>
-        <w:t xml:space="preserve"> in total, down from around 120MB of unused template material that was removed.</w:t>
+        <w:t xml:space="preserve"> in total, after unused files were cleared out and every photograph was resized to the dimensions it is actually displayed at.</w:t>
       </w:r>
     </w:p>
     <w:p>

</xml_diff>